<commit_message>
Record user-reported live tests and clear recovered email errors
</commit_message>
<xml_diff>
--- a/submission/SOLUTION_REPORT.docx
+++ b/submission/SOLUTION_REPORT.docx
@@ -64,7 +64,7 @@
     </w:p>
     <w:p>
       <w:r>
-        <w:t>For portal tasks, the next due date is the actual completion calendar date plus 7, 15 or 30 days, at the configured cutoff. Daily work advances to the next Monday–Friday. One unresolved cycle stays open; missed dates do not generate duplicate work. Completion-anchored recurrence deliberately shifts deadlines after late completion. Employees never calculate dates or repeat the update in another sheet.</w:t>
+        <w:t>For portal tasks, the next due date is the actual completion calendar date plus 7, 15 or 30 days, at the configured cutoff. Daily work advances to the next Mondayâ€“Friday. One unresolved cycle stays open; missed dates do not generate duplicate work. Completion-anchored recurrence deliberately shifts deadlines after late completion. Employees never calculate dates or repeat the update in another sheet.</w:t>
       </w:r>
     </w:p>
     <w:p>
@@ -610,7 +610,7 @@
     </w:tbl>
     <w:p>
       <w:r>
-        <w:t>Verification: 29/29 automated tests pass. Source syntax, manifest JSON and standalone preview are checked. Evidence includes TEST_RESULTS.tap, DEMO_RESULTS.json and source SHA-256 hashes. Google-service adapters simulate spreadsheet storage, protections, triggers, time, user identity and MailApp. These results do not prove live Google integration or real delivery.</w:t>
+        <w:t>Verification: 30/30 automated tests pass. Source syntax, manifest JSON and standalone preview are checked. Evidence includes TEST_RESULTS.tap, DEMO_RESULTS.json and source SHA-256 hashes. Google-service adapters simulate spreadsheet storage, protections, triggers, time, user identity and MailApp. These results do not prove live Google integration or real delivery.</w:t>
       </w:r>
     </w:p>
     <w:p>
@@ -636,7 +636,7 @@
     </w:p>
     <w:p>
       <w:r>
-        <w:t>Local source, simulation and documentation checkpoints are complete. A live Google Sheet URL, owner authorization, actual employee/manager identity tests, real manager/leadership email receipts and candidate contact/portfolio details remain pending. The XLSX template does not embed Apps Script. Follow DEPLOYMENT.md and complete HOSTED_ACCEPTANCE.md before describing this as a fully verified live submission.</w:t>
+        <w:t>Local checks are complete. The user subsequently deployed a live Sheet and confirmed completion, acknowledgement, actual manager/leadership receipts and duplicate prevention. These are user-reported tests using one account for all roles; distinct-user permission testing and final Health confirmation remain. See HOSTED_ACCEPTANCE.md. The XLSX template does not embed Apps Script.</w:t>
       </w:r>
     </w:p>
     <w:p>

</xml_diff>